<commit_message>
Full Grade 10 revision run: folder, brief v3, queue; journal: Accept/Edit checkboxes, typing space, per-sub-strand sections
Co-Authored-By: Claude Sonnet 5.5 <noreply@anthropic.com>
</commit_message>
<xml_diff>
--- a/data/revised_2026-10_pilot2/journal/Journal_00_Master_Index.docx
+++ b/data/revised_2026-10_pilot2/journal/Journal_00_Master_Index.docx
@@ -85,7 +85,30 @@
           <w:sz w:val="17"/>
           <w:szCs w:val="17"/>
         </w:rPr>
-        <w:t xml:space="preserve">Rows shaded yellow need a teacher decision (a judgement call or a flag with no change made). Tick the box in the last column and write any note beside the row.</w:t>
+        <w:t xml:space="preserve">Rows shaded yellow need a teacher decision (a judgement call or a flag with no change made).</w:t>
+      </w:r>
+    </w:p>
+    <w:p>
+      <w:pPr>
+        <w:spacing w:after="60" w:before="0"/>
+      </w:pPr>
+      <w:r>
+        <w:rPr>
+          <w:rFonts w:ascii="Arial" w:cs="Arial" w:eastAsia="Arial" w:hAnsi="Arial"/>
+          <w:b/>
+          <w:bCs/>
+          <w:sz w:val="17"/>
+          <w:szCs w:val="17"/>
+        </w:rPr>
+        <w:t xml:space="preserve">How to respond (every item, in the last column): </w:t>
+      </w:r>
+      <w:r>
+        <w:rPr>
+          <w:rFonts w:ascii="Arial" w:cs="Arial" w:eastAsia="Arial" w:hAnsi="Arial"/>
+          <w:sz w:val="17"/>
+          <w:szCs w:val="17"/>
+        </w:rPr>
+        <w:t xml:space="preserve">click ONE box, ACCEPT or EDIT. If you choose EDIT, type the change you want in the space under it. Save the file under the same name and send it back. Every item carries its sub-strand name, and each section has the sub-strand in the page header, so please keep the items in this document.</w:t>
       </w:r>
     </w:p>
     <w:p>

</xml_diff>